<commit_message>
docs(rapport-e3): ajoute les captures de la chaîne CI (C13)
Le rapport E3 ne contenait aucune illustration alors qu'il décrit la
chaîne de livraison continue. Trois figures issues du run #9 (commit
f70b0e1 sur main, huit jobs au vert) :

- §6.1 : le graphe complet, qui rend visibles les dépendances needs:
- §6.2 : le job Build & Push — ml-api (publication sur ghcr.io)
- §6.3 : le job Deploy (verify pull) — ml-api, qui donne son sens au
  périmètre assumé : le packaging est vérifié utilisable même sans
  serveur de production dédié

Captures prises via Playwright sur le Chrome système, dépôt public donc
pages accessibles sans authentification. Limite : le contenu des logs
n'est visible que pour un utilisateur connecté, les captures montrent
donc les étapes et leur statut, pas la sortie détaillée.

Co-Authored-By: Claude Opus 5 <noreply@anthropic.com>
</commit_message>
<xml_diff>
--- a/rapports/Rapport_Bloc3_Mise_En_Service_Modele_IA.docx
+++ b/rapports/Rapport_Bloc3_Mise_En_Service_Modele_IA.docx
@@ -5948,22 +5948,54 @@
     </w:p>
     <w:p>
       <w:pPr>
-        <w:pStyle w:val="Heading2"/>
-        <w:rPr/>
-      </w:pPr>
-      <w:r>
-        <w:rPr/>
-        <w:t>6.2 Packaging</w:t>
+        <w:jc w:val="center"/>
+      </w:pPr>
+      <w:r>
+        <w:drawing>
+          <wp:inline xmlns:a="http://schemas.openxmlformats.org/drawingml/2006/main" xmlns:pic="http://schemas.openxmlformats.org/drawingml/2006/picture">
+            <wp:extent cx="4680000" cy="2121839"/>
+            <wp:docPr id="1" name="Picture 1"/>
+            <wp:cNvGraphicFramePr>
+              <a:graphicFrameLocks noChangeAspect="1"/>
+            </wp:cNvGraphicFramePr>
+            <a:graphic>
+              <a:graphicData uri="http://schemas.openxmlformats.org/drawingml/2006/picture">
+                <pic:pic>
+                  <pic:nvPicPr>
+                    <pic:cNvPr id="0" name="crop_ci_overview.png"/>
+                    <pic:cNvPicPr/>
+                  </pic:nvPicPr>
+                  <pic:blipFill>
+                    <a:blip r:embed="rId7"/>
+                    <a:stretch>
+                      <a:fillRect/>
+                    </a:stretch>
+                  </pic:blipFill>
+                  <pic:spPr>
+                    <a:xfrm>
+                      <a:off x="0" y="0"/>
+                      <a:ext cx="4680000" cy="2121839"/>
+                    </a:xfrm>
+                    <a:prstGeom prst="rect"/>
+                  </pic:spPr>
+                </pic:pic>
+              </a:graphicData>
+            </a:graphic>
+          </wp:inline>
+        </w:drawing>
       </w:r>
     </w:p>
     <w:p>
       <w:pPr>
-        <w:pStyle w:val="Normal"/>
-        <w:rPr/>
-      </w:pPr>
-      <w:r>
-        <w:rPr/>
-        <w:t>L'image est construite via docker/build-push-action, authentifiée sur le registre par le GITHUB_TOKEN natif (aucun secret supplémentaire à gérer), et poussée vers ghcr.io/&lt;owner&gt;/crypto-ml-api avec deux tags : latest (dernière version sur main) et le SHA du commit (traçabilité exacte de la version déployée). Le build a été testé localement avec exactement le même contexte que la CI (Bloc3_ml/api.Dockerfile) avant d'être intégré au workflow, pour éviter de découvrir une erreur de build seulement après un push.</w:t>
+        <w:jc w:val="center"/>
+      </w:pPr>
+      <w:r>
+        <w:rPr>
+          <w:i/>
+          <w:color w:val="595659"/>
+          <w:sz w:val="18"/>
+        </w:rPr>
+        <w:t>Figure 1 — Chaîne CI complète sur GitHub Actions (run #9, commit f70b0e1 sur main). Le graphe rend visibles les dépendances needs: — les jobs de build ne démarrent qu'après le succès des tests, et la vérification de récupération qu'après le build.</w:t>
       </w:r>
     </w:p>
     <w:p>
@@ -5973,7 +6005,7 @@
       </w:pPr>
       <w:r>
         <w:rPr/>
-        <w:t>6.3 Déploiement — périmètre assumé</w:t>
+        <w:t>6.2 Packaging</w:t>
       </w:r>
     </w:p>
     <w:p>
@@ -5983,27 +6015,151 @@
       </w:pPr>
       <w:r>
         <w:rPr/>
-        <w:t>Ce projet n'a pas de serveur de production dédié (contrairement à un contexte d'entreprise avec infrastructure déployée) — le déploiement est donc scopé à ce qui est réellement vérifiable plutôt que simulé. Le job deploy-ml-api vérifie que l'image fraîchement publiée est effectivement récupérable depuis le registre (docker pull), ce qui constitue une preuve concrète que le packaging produit un artefact utilisable — puis documente la commande réelle de redéploiement plutôt que de prétendre exécuter un déploiement automatisé vers un serveur qui n'existe pas :</w:t>
+        <w:t>L'image est construite via docker/build-push-action, authentifiée sur le registre par le GITHUB_TOKEN natif (aucun secret supplémentaire à gérer), et poussée vers ghcr.io/&lt;owner&gt;/crypto-ml-api avec deux tags : latest (dernière version sur main) et le SHA du commit (traçabilité exacte de la version déployée). Le build a été testé localement avec exactement le même contexte que la CI (Bloc3_ml/api.Dockerfile) avant d'être intégré au workflow, pour éviter de découvrir une erreur de build seulement après un push.</w:t>
       </w:r>
     </w:p>
     <w:p>
       <w:pPr>
-        <w:pStyle w:val="IntenseQuote"/>
-        <w:rPr/>
-      </w:pPr>
-      <w:r>
-        <w:rPr/>
-        <w:t>docker compose pull ml-api &amp;&amp; docker compose up -d ml-api</w:t>
+        <w:jc w:val="center"/>
+      </w:pPr>
+      <w:r>
+        <w:drawing>
+          <wp:inline xmlns:a="http://schemas.openxmlformats.org/drawingml/2006/main" xmlns:pic="http://schemas.openxmlformats.org/drawingml/2006/picture">
+            <wp:extent cx="4680000" cy="1822988"/>
+            <wp:docPr id="2" name="Picture 2"/>
+            <wp:cNvGraphicFramePr>
+              <a:graphicFrameLocks noChangeAspect="1"/>
+            </wp:cNvGraphicFramePr>
+            <a:graphic>
+              <a:graphicData uri="http://schemas.openxmlformats.org/drawingml/2006/picture">
+                <pic:pic>
+                  <pic:nvPicPr>
+                    <pic:cNvPr id="0" name="crop_ci_build_ml_api.png"/>
+                    <pic:cNvPicPr/>
+                  </pic:nvPicPr>
+                  <pic:blipFill>
+                    <a:blip r:embed="rId8"/>
+                    <a:stretch>
+                      <a:fillRect/>
+                    </a:stretch>
+                  </pic:blipFill>
+                  <pic:spPr>
+                    <a:xfrm>
+                      <a:off x="0" y="0"/>
+                      <a:ext cx="4680000" cy="1822988"/>
+                    </a:xfrm>
+                    <a:prstGeom prst="rect"/>
+                  </pic:spPr>
+                </pic:pic>
+              </a:graphicData>
+            </a:graphic>
+          </wp:inline>
+        </w:drawing>
       </w:r>
     </w:p>
     <w:p>
       <w:pPr>
+        <w:jc w:val="center"/>
+      </w:pPr>
+      <w:r>
+        <w:rPr>
+          <w:i/>
+          <w:color w:val="595659"/>
+          <w:sz w:val="18"/>
+        </w:rPr>
+        <w:t>Figure 2 — Job « Build &amp; Push — ml-api (ghcr.io) » : authentification au registre par le GITHUB_TOKEN natif, puis construction et publication de l'image, réussi en 1 min 31 s.</w:t>
+      </w:r>
+    </w:p>
+    <w:p>
+      <w:pPr>
+        <w:pStyle w:val="Heading2"/>
+        <w:rPr/>
+      </w:pPr>
+      <w:r>
+        <w:rPr/>
+        <w:t>6.3 Déploiement — périmètre assumé</w:t>
+      </w:r>
+    </w:p>
+    <w:p>
+      <w:pPr>
         <w:pStyle w:val="Normal"/>
         <w:rPr/>
       </w:pPr>
       <w:r>
         <w:rPr/>
+        <w:t>Ce projet n'a pas de serveur de production dédié (contrairement à un contexte d'entreprise avec infrastructure déployée) — le déploiement est donc scopé à ce qui est réellement vérifiable plutôt que simulé. Le job deploy-ml-api vérifie que l'image fraîchement publiée est effectivement récupérable depuis le registre (docker pull), ce qui constitue une preuve concrète que le packaging produit un artefact utilisable — puis documente la commande réelle de redéploiement plutôt que de prétendre exécuter un déploiement automatisé vers un serveur qui n'existe pas :</w:t>
+      </w:r>
+    </w:p>
+    <w:p>
+      <w:pPr>
+        <w:pStyle w:val="IntenseQuote"/>
+        <w:rPr/>
+      </w:pPr>
+      <w:r>
+        <w:rPr/>
+        <w:t>docker compose pull ml-api &amp;&amp; docker compose up -d ml-api</w:t>
+      </w:r>
+    </w:p>
+    <w:p>
+      <w:pPr>
+        <w:pStyle w:val="Normal"/>
+        <w:rPr/>
+      </w:pPr>
+      <w:r>
+        <w:rPr/>
         <w:t>Ce choix est documenté explicitement comme un périmètre assumé (cf. bilan) plutôt que présenté comme une limitation cachée.</w:t>
+      </w:r>
+    </w:p>
+    <w:p>
+      <w:pPr>
+        <w:jc w:val="center"/>
+      </w:pPr>
+      <w:r>
+        <w:drawing>
+          <wp:inline xmlns:a="http://schemas.openxmlformats.org/drawingml/2006/main" xmlns:pic="http://schemas.openxmlformats.org/drawingml/2006/picture">
+            <wp:extent cx="4680000" cy="1822988"/>
+            <wp:docPr id="3" name="Picture 3"/>
+            <wp:cNvGraphicFramePr>
+              <a:graphicFrameLocks noChangeAspect="1"/>
+            </wp:cNvGraphicFramePr>
+            <a:graphic>
+              <a:graphicData uri="http://schemas.openxmlformats.org/drawingml/2006/picture">
+                <pic:pic>
+                  <pic:nvPicPr>
+                    <pic:cNvPr id="0" name="crop_ci_deploy_ml_api.png"/>
+                    <pic:cNvPicPr/>
+                  </pic:nvPicPr>
+                  <pic:blipFill>
+                    <a:blip r:embed="rId9"/>
+                    <a:stretch>
+                      <a:fillRect/>
+                    </a:stretch>
+                  </pic:blipFill>
+                  <pic:spPr>
+                    <a:xfrm>
+                      <a:off x="0" y="0"/>
+                      <a:ext cx="4680000" cy="1822988"/>
+                    </a:xfrm>
+                    <a:prstGeom prst="rect"/>
+                  </pic:spPr>
+                </pic:pic>
+              </a:graphicData>
+            </a:graphic>
+          </wp:inline>
+        </w:drawing>
+      </w:r>
+    </w:p>
+    <w:p>
+      <w:pPr>
+        <w:jc w:val="center"/>
+      </w:pPr>
+      <w:r>
+        <w:rPr>
+          <w:i/>
+          <w:color w:val="595659"/>
+          <w:sz w:val="18"/>
+        </w:rPr>
+        <w:t>Figure 3 — Job « Deploy (verify pull) — ml-api » : l'image publiée est effectivement récupérée depuis ghcr.io. C'est la vérification qui donne son sens au périmètre assumé ci-dessus — le packaging est utilisable, même sans serveur de production dédié.</w:t>
       </w:r>
     </w:p>
     <w:p>

</xml_diff>